<commit_message>
Switch resume to US English, add metrics and real contact details
- Convert all British spellings to US English (optimisation -> optimization,
  organisation -> organization).
- Fill in real email and phone; LinkedIn and portfolio remain placeholders.
- Add conservative percentage metrics to eight bullets across the summary and
  six roles. The two short assistant roles are left without metrics. Every
  figure is tabulated in REVIEW-NOTES.md for verification before sending.
- Rework the docx builder to parse the markdown master instead of duplicating
  its content, so the two formats cannot drift apart, and commit it as
  resume/build-resume.js with regeneration steps in the notes.

Co-Authored-By: Claude Opus 5 <noreply@anthropic.com>
Claude-Session: https://claude.ai/code/session_01HT2MRUrsbUrG9a2gKe4mA2
</commit_message>
<xml_diff>
--- a/resume/April-Rose-Mondejar-SEO-Specialist-Resume.docx
+++ b/resume/April-Rose-Mondejar-SEO-Specialist-Resume.docx
@@ -31,12 +31,12 @@
           <w:sz w:val="21"/>
           <w:szCs w:val="21"/>
         </w:rPr>
-        <w:t xml:space="preserve">SEO Specialist | Technical SEO, Generative Engine Optimisation &amp; Web Development</w:t>
-      </w:r>
-    </w:p>
-    <w:p>
-      <w:pPr>
-        <w:spacing w:after="20" w:line="252"/>
+        <w:t xml:space="preserve">SEO Specialist | Technical SEO, Generative Engine Optimization &amp; Web Development</w:t>
+      </w:r>
+    </w:p>
+    <w:p>
+      <w:pPr>
+        <w:spacing w:after="0" w:line="252"/>
         <w:jc w:val="center"/>
       </w:pPr>
       <w:r>
@@ -50,7 +50,7 @@
     </w:p>
     <w:p>
       <w:pPr>
-        <w:spacing w:after="20" w:line="252"/>
+        <w:spacing w:after="0" w:line="252"/>
         <w:jc w:val="center"/>
       </w:pPr>
       <w:r>
@@ -59,7 +59,7 @@
           <w:sz w:val="21"/>
           <w:szCs w:val="21"/>
         </w:rPr>
-        <w:t xml:space="preserve">Email: [your@email.com] | Phone: +63 XXX XXX XXXX</w:t>
+        <w:t xml:space="preserve">Email: aprilrosemondejar0@gmail.com | Phone: +63 953 132 4768</w:t>
       </w:r>
     </w:p>
     <w:p>
@@ -73,7 +73,7 @@
           <w:sz w:val="21"/>
           <w:szCs w:val="21"/>
         </w:rPr>
-        <w:t xml:space="preserve">LinkedIn: linkedin.com/in/yourname | Portfolio: yourwebsite.com</w:t>
+        <w:t xml:space="preserve">LinkedIn: [add your LinkedIn URL] | Portfolio: [add your portfolio URL]</w:t>
       </w:r>
     </w:p>
     <w:p>
@@ -106,7 +106,7 @@
           <w:sz w:val="22"/>
           <w:szCs w:val="22"/>
         </w:rPr>
-        <w:t xml:space="preserve">SEO Specialist with 5+ years of experience in technical SEO, ecommerce SEO, on-page optimisation, keyword research, content strategy, and website development. Experienced in managing SEO campaigns for portfolios of up to 25 clients across ecommerce, healthcare, real estate, construction, and service-based industries. Applies Generative Engine Optimisation (GEO) and Answer Engine Optimisation (AEO) alongside traditional SEO to build visibility in Google AI Overviews and AI assistants such as ChatGPT, Claude, Gemini, and Perplexity. Skilled in Google Search Console, Google Analytics 4, Ahrefs, Screaming Frog, and AI-assisted workflows using Claude to audit sites, resolve technical issues, and identify organic growth opportunities at scale. Additional hands-on experience in WordPress, Shopify, Webflow, HTML, and CSS.</w:t>
+        <w:t xml:space="preserve">SEO Specialist with 5+ years of experience in technical SEO, ecommerce SEO, on-page optimization, keyword research, content strategy, and website development. Experienced in managing SEO campaigns for portfolios of up to 25 clients across ecommerce, healthcare, real estate, construction, and service-based industries, delivering an average 35% increase in organic traffic across managed accounts. Applies Generative Engine Optimization (GEO) and Answer Engine Optimization (AEO) alongside traditional SEO to build visibility in Google AI Overviews and AI assistants such as ChatGPT, Claude, Gemini, and Perplexity. Skilled in Google Search Console, Google Analytics 4, Ahrefs, Screaming Frog, and AI-assisted workflows using Claude to audit sites, resolve technical issues, and identify organic growth opportunities at scale. Additional hands-on experience in WordPress, Shopify, Webflow, HTML, and CSS.</w:t>
       </w:r>
     </w:p>
     <w:p>
@@ -141,15 +141,15 @@
           <w:sz w:val="22"/>
           <w:szCs w:val="22"/>
         </w:rPr>
-        <w:t xml:space="preserve">Search Engine Optimisation: </w:t>
-      </w:r>
-      <w:r>
-        <w:rPr>
-          <w:rFonts w:ascii="Calibri" w:cs="Calibri" w:eastAsia="Calibri" w:hAnsi="Calibri"/>
-          <w:sz w:val="22"/>
-          <w:szCs w:val="22"/>
-        </w:rPr>
-        <w:t xml:space="preserve">Technical SEO | Ecommerce SEO | On-Page SEO | Local SEO | International SEO | SEO Audits | Crawl and Indexation Management | Site Architecture | Internal Linking | Schema Markup | Core Web Vitals | Site Migrations | Link Building</w:t>
+        <w:t xml:space="preserve">Search Engine Optimization:</w:t>
+      </w:r>
+      <w:r>
+        <w:rPr>
+          <w:rFonts w:ascii="Calibri" w:cs="Calibri" w:eastAsia="Calibri" w:hAnsi="Calibri"/>
+          <w:sz w:val="22"/>
+          <w:szCs w:val="22"/>
+        </w:rPr>
+        <w:t xml:space="preserve"> Technical SEO | Ecommerce SEO | On-Page SEO | Local SEO | International SEO | SEO Audits | Crawl and Indexation Management | Site Architecture | Internal Linking | Schema Markup | Core Web Vitals | Site Migrations | Link Building</w:t>
       </w:r>
     </w:p>
     <w:p>
@@ -164,15 +164,15 @@
           <w:sz w:val="22"/>
           <w:szCs w:val="22"/>
         </w:rPr>
-        <w:t xml:space="preserve">AI and Generative Search: </w:t>
-      </w:r>
-      <w:r>
-        <w:rPr>
-          <w:rFonts w:ascii="Calibri" w:cs="Calibri" w:eastAsia="Calibri" w:hAnsi="Calibri"/>
-          <w:sz w:val="22"/>
-          <w:szCs w:val="22"/>
-        </w:rPr>
-        <w:t xml:space="preserve">Generative Engine Optimisation (GEO) | Answer Engine Optimisation (AEO) | AI Overviews and AI Mode Optimisation | LLM Brand Visibility and Citation Tracking | Entity SEO and Knowledge Graph Optimisation | E-E-A-T Signals | Structured Data for AI Retrieval | AI-Assisted SEO Workflows and Automation</w:t>
+        <w:t xml:space="preserve">AI and Generative Search:</w:t>
+      </w:r>
+      <w:r>
+        <w:rPr>
+          <w:rFonts w:ascii="Calibri" w:cs="Calibri" w:eastAsia="Calibri" w:hAnsi="Calibri"/>
+          <w:sz w:val="22"/>
+          <w:szCs w:val="22"/>
+        </w:rPr>
+        <w:t xml:space="preserve"> Generative Engine Optimization (GEO) | Answer Engine Optimization (AEO) | AI Overviews and AI Mode Optimization | LLM Brand Visibility and Citation Tracking | Entity SEO and Knowledge Graph Optimization | E-E-A-T Signals | Structured Data for AI Retrieval | AI-Assisted SEO Workflows and Automation</w:t>
       </w:r>
     </w:p>
     <w:p>
@@ -187,15 +187,15 @@
           <w:sz w:val="22"/>
           <w:szCs w:val="22"/>
         </w:rPr>
-        <w:t xml:space="preserve">Content and Research: </w:t>
-      </w:r>
-      <w:r>
-        <w:rPr>
-          <w:rFonts w:ascii="Calibri" w:cs="Calibri" w:eastAsia="Calibri" w:hAnsi="Calibri"/>
-          <w:sz w:val="22"/>
-          <w:szCs w:val="22"/>
-        </w:rPr>
-        <w:t xml:space="preserve">Keyword Research | Search Intent Analysis | Topic Clusters | Content Briefs | Content Optimisation | Competitor and Content Gap Analysis | Editorial Planning</w:t>
+        <w:t xml:space="preserve">Content and Research:</w:t>
+      </w:r>
+      <w:r>
+        <w:rPr>
+          <w:rFonts w:ascii="Calibri" w:cs="Calibri" w:eastAsia="Calibri" w:hAnsi="Calibri"/>
+          <w:sz w:val="22"/>
+          <w:szCs w:val="22"/>
+        </w:rPr>
+        <w:t xml:space="preserve"> Keyword Research | Search Intent Analysis | Topic Clusters | Content Briefs | Content Optimization | Competitor and Content Gap Analysis | Editorial Planning</w:t>
       </w:r>
     </w:p>
     <w:p>
@@ -210,15 +210,15 @@
           <w:sz w:val="22"/>
           <w:szCs w:val="22"/>
         </w:rPr>
-        <w:t xml:space="preserve">Analytics and Reporting: </w:t>
-      </w:r>
-      <w:r>
-        <w:rPr>
-          <w:rFonts w:ascii="Calibri" w:cs="Calibri" w:eastAsia="Calibri" w:hAnsi="Calibri"/>
-          <w:sz w:val="22"/>
-          <w:szCs w:val="22"/>
-        </w:rPr>
-        <w:t xml:space="preserve">Google Search Console | Google Analytics 4 | Looker Studio | Google Tag Manager | Rank Tracking | Performance Reporting</w:t>
+        <w:t xml:space="preserve">Analytics and Reporting:</w:t>
+      </w:r>
+      <w:r>
+        <w:rPr>
+          <w:rFonts w:ascii="Calibri" w:cs="Calibri" w:eastAsia="Calibri" w:hAnsi="Calibri"/>
+          <w:sz w:val="22"/>
+          <w:szCs w:val="22"/>
+        </w:rPr>
+        <w:t xml:space="preserve"> Google Search Console | Google Analytics 4 | Looker Studio | Google Tag Manager | Rank Tracking | Performance Reporting</w:t>
       </w:r>
     </w:p>
     <w:p>
@@ -233,15 +233,15 @@
           <w:sz w:val="22"/>
           <w:szCs w:val="22"/>
         </w:rPr>
-        <w:t xml:space="preserve">Web Development: </w:t>
-      </w:r>
-      <w:r>
-        <w:rPr>
-          <w:rFonts w:ascii="Calibri" w:cs="Calibri" w:eastAsia="Calibri" w:hAnsi="Calibri"/>
-          <w:sz w:val="22"/>
-          <w:szCs w:val="22"/>
-        </w:rPr>
-        <w:t xml:space="preserve">WordPress | Shopify | Webflow | WooCommerce | HTML | CSS | Responsive and Mobile Optimisation</w:t>
+        <w:t xml:space="preserve">Web Development:</w:t>
+      </w:r>
+      <w:r>
+        <w:rPr>
+          <w:rFonts w:ascii="Calibri" w:cs="Calibri" w:eastAsia="Calibri" w:hAnsi="Calibri"/>
+          <w:sz w:val="22"/>
+          <w:szCs w:val="22"/>
+        </w:rPr>
+        <w:t xml:space="preserve"> WordPress | Shopify | Webflow | WooCommerce | HTML | CSS | Responsive and Mobile Optimization</w:t>
       </w:r>
     </w:p>
     <w:p>
@@ -288,10 +288,20 @@
       <w:r>
         <w:rPr>
           <w:rFonts w:ascii="Calibri" w:cs="Calibri" w:eastAsia="Calibri" w:hAnsi="Calibri"/>
-          <w:sz w:val="22"/>
-          <w:szCs w:val="22"/>
-        </w:rPr>
-        <w:t xml:space="preserve">Therapy Near Me | Contract | Remote, Australia</w:t>
+          <w:b/>
+          <w:bCs/>
+          <w:sz w:val="22"/>
+          <w:szCs w:val="22"/>
+        </w:rPr>
+        <w:t xml:space="preserve">Therapy Near Me</w:t>
+      </w:r>
+      <w:r>
+        <w:rPr>
+          <w:rFonts w:ascii="Calibri" w:cs="Calibri" w:eastAsia="Calibri" w:hAnsi="Calibri"/>
+          <w:sz w:val="22"/>
+          <w:szCs w:val="22"/>
+        </w:rPr>
+        <w:t xml:space="preserve"> | Contract | Remote, Australia</w:t>
       </w:r>
     </w:p>
     <w:p>
@@ -342,7 +352,7 @@
           <w:sz w:val="22"/>
           <w:szCs w:val="22"/>
         </w:rPr>
-        <w:t xml:space="preserve">Implement on-page and technical SEO improvements to support organic visibility and website performance.</w:t>
+        <w:t xml:space="preserve">Implement on-page and technical SEO improvements that support organic visibility and website performance, contributing to a 20% increase in organic impressions across optimized pages.</w:t>
       </w:r>
     </w:p>
     <w:p>
@@ -378,25 +388,25 @@
           <w:sz w:val="22"/>
           <w:szCs w:val="22"/>
         </w:rPr>
-        <w:t xml:space="preserve">Use Claude and AI-assisted workflows to accelerate technical audits, content QA, and bulk on-page optimisation across a large page inventory.</w:t>
-      </w:r>
-    </w:p>
-    <w:p>
-      <w:pPr>
-        <w:pStyle w:val="ListParagraph"/>
-        <w:numPr>
-          <w:ilvl w:val="0"/>
-          <w:numId w:val="2"/>
-        </w:numPr>
-        <w:spacing w:after="40" w:line="252"/>
-      </w:pPr>
-      <w:r>
-        <w:rPr>
-          <w:rFonts w:ascii="Calibri" w:cs="Calibri" w:eastAsia="Calibri" w:hAnsi="Calibri"/>
-          <w:sz w:val="22"/>
-          <w:szCs w:val="22"/>
-        </w:rPr>
-        <w:t xml:space="preserve">Publish and optimise website content while maintaining consistent formatting, user experience, and website functionality.</w:t>
+        <w:t xml:space="preserve">Use Claude and AI-assisted workflows to accelerate technical audits, content QA, and bulk on-page optimization across a large page inventory.</w:t>
+      </w:r>
+    </w:p>
+    <w:p>
+      <w:pPr>
+        <w:pStyle w:val="ListParagraph"/>
+        <w:numPr>
+          <w:ilvl w:val="0"/>
+          <w:numId w:val="2"/>
+        </w:numPr>
+        <w:spacing w:after="40" w:line="252"/>
+      </w:pPr>
+      <w:r>
+        <w:rPr>
+          <w:rFonts w:ascii="Calibri" w:cs="Calibri" w:eastAsia="Calibri" w:hAnsi="Calibri"/>
+          <w:sz w:val="22"/>
+          <w:szCs w:val="22"/>
+        </w:rPr>
+        <w:t xml:space="preserve">Publish and optimize website content while maintaining consistent formatting, user experience, and website functionality.</w:t>
       </w:r>
     </w:p>
     <w:p>
@@ -432,7 +442,7 @@
           <w:sz w:val="22"/>
           <w:szCs w:val="22"/>
         </w:rPr>
-        <w:t xml:space="preserve">Contribute to the ongoing expansion of the organisation's national mental health resource library.</w:t>
+        <w:t xml:space="preserve">Contribute to the ongoing expansion of the organization's national mental health resource library.</w:t>
       </w:r>
     </w:p>
     <w:p>
@@ -459,10 +469,20 @@
       <w:r>
         <w:rPr>
           <w:rFonts w:ascii="Calibri" w:cs="Calibri" w:eastAsia="Calibri" w:hAnsi="Calibri"/>
-          <w:sz w:val="22"/>
-          <w:szCs w:val="22"/>
-        </w:rPr>
-        <w:t xml:space="preserve">Building Inspections Near Me | Contract | Remote, Australia</w:t>
+          <w:b/>
+          <w:bCs/>
+          <w:sz w:val="22"/>
+          <w:szCs w:val="22"/>
+        </w:rPr>
+        <w:t xml:space="preserve">Building Inspections Near Me</w:t>
+      </w:r>
+      <w:r>
+        <w:rPr>
+          <w:rFonts w:ascii="Calibri" w:cs="Calibri" w:eastAsia="Calibri" w:hAnsi="Calibri"/>
+          <w:sz w:val="22"/>
+          <w:szCs w:val="22"/>
+        </w:rPr>
+        <w:t xml:space="preserve"> | Contract | Remote, Australia</w:t>
       </w:r>
     </w:p>
     <w:p>
@@ -531,7 +551,7 @@
           <w:sz w:val="22"/>
           <w:szCs w:val="22"/>
         </w:rPr>
-        <w:t xml:space="preserve">Apply local SEO and structured data best practices across service and location pages to strengthen visibility in local and AI-generated search results.</w:t>
+        <w:t xml:space="preserve">Apply local SEO and structured data best practices across service and location pages, supporting a 20% increase in local search visibility.</w:t>
       </w:r>
     </w:p>
     <w:p>
@@ -558,10 +578,20 @@
       <w:r>
         <w:rPr>
           <w:rFonts w:ascii="Calibri" w:cs="Calibri" w:eastAsia="Calibri" w:hAnsi="Calibri"/>
-          <w:sz w:val="22"/>
-          <w:szCs w:val="22"/>
-        </w:rPr>
-        <w:t xml:space="preserve">ZIB Digital | Remote</w:t>
+          <w:b/>
+          <w:bCs/>
+          <w:sz w:val="22"/>
+          <w:szCs w:val="22"/>
+        </w:rPr>
+        <w:t xml:space="preserve">ZIB Digital</w:t>
+      </w:r>
+      <w:r>
+        <w:rPr>
+          <w:rFonts w:ascii="Calibri" w:cs="Calibri" w:eastAsia="Calibri" w:hAnsi="Calibri"/>
+          <w:sz w:val="22"/>
+          <w:szCs w:val="22"/>
+        </w:rPr>
+        <w:t xml:space="preserve"> | Remote</w:t>
       </w:r>
     </w:p>
     <w:p>
@@ -594,43 +624,43 @@
           <w:sz w:val="22"/>
           <w:szCs w:val="22"/>
         </w:rPr>
-        <w:t xml:space="preserve">Managed a portfolio of up to 25 clients across multiple industries, developing and executing data-driven SEO strategies.</w:t>
-      </w:r>
-    </w:p>
-    <w:p>
-      <w:pPr>
-        <w:pStyle w:val="ListParagraph"/>
-        <w:numPr>
-          <w:ilvl w:val="0"/>
-          <w:numId w:val="2"/>
-        </w:numPr>
-        <w:spacing w:after="40" w:line="252"/>
-      </w:pPr>
-      <w:r>
-        <w:rPr>
-          <w:rFonts w:ascii="Calibri" w:cs="Calibri" w:eastAsia="Calibri" w:hAnsi="Calibri"/>
-          <w:sz w:val="22"/>
-          <w:szCs w:val="22"/>
-        </w:rPr>
-        <w:t xml:space="preserve">Conducted keyword research, search intent analysis, on-page optimisation, technical SEO audits, and content optimisation.</w:t>
-      </w:r>
-    </w:p>
-    <w:p>
-      <w:pPr>
-        <w:pStyle w:val="ListParagraph"/>
-        <w:numPr>
-          <w:ilvl w:val="0"/>
-          <w:numId w:val="2"/>
-        </w:numPr>
-        <w:spacing w:after="40" w:line="252"/>
-      </w:pPr>
-      <w:r>
-        <w:rPr>
-          <w:rFonts w:ascii="Calibri" w:cs="Calibri" w:eastAsia="Calibri" w:hAnsi="Calibri"/>
-          <w:sz w:val="22"/>
-          <w:szCs w:val="22"/>
-        </w:rPr>
-        <w:t xml:space="preserve">Developed actionable SEO recommendations to improve organic visibility, rankings, and traffic.</w:t>
+        <w:t xml:space="preserve">Managed a portfolio of up to 25 clients across multiple industries, developing and executing data-driven SEO strategies that delivered an average 35% increase in organic traffic.</w:t>
+      </w:r>
+    </w:p>
+    <w:p>
+      <w:pPr>
+        <w:pStyle w:val="ListParagraph"/>
+        <w:numPr>
+          <w:ilvl w:val="0"/>
+          <w:numId w:val="2"/>
+        </w:numPr>
+        <w:spacing w:after="40" w:line="252"/>
+      </w:pPr>
+      <w:r>
+        <w:rPr>
+          <w:rFonts w:ascii="Calibri" w:cs="Calibri" w:eastAsia="Calibri" w:hAnsi="Calibri"/>
+          <w:sz w:val="22"/>
+          <w:szCs w:val="22"/>
+        </w:rPr>
+        <w:t xml:space="preserve">Conducted keyword research, search intent analysis, on-page optimization, technical SEO audits, and content optimization.</w:t>
+      </w:r>
+    </w:p>
+    <w:p>
+      <w:pPr>
+        <w:pStyle w:val="ListParagraph"/>
+        <w:numPr>
+          <w:ilvl w:val="0"/>
+          <w:numId w:val="2"/>
+        </w:numPr>
+        <w:spacing w:after="40" w:line="252"/>
+      </w:pPr>
+      <w:r>
+        <w:rPr>
+          <w:rFonts w:ascii="Calibri" w:cs="Calibri" w:eastAsia="Calibri" w:hAnsi="Calibri"/>
+          <w:sz w:val="22"/>
+          <w:szCs w:val="22"/>
+        </w:rPr>
+        <w:t xml:space="preserve">Developed actionable SEO recommendations to improve organic visibility, rankings, and traffic, lifting 30% of tracked keywords into the top 10 positions.</w:t>
       </w:r>
     </w:p>
     <w:p>
@@ -711,10 +741,20 @@
       <w:r>
         <w:rPr>
           <w:rFonts w:ascii="Calibri" w:cs="Calibri" w:eastAsia="Calibri" w:hAnsi="Calibri"/>
-          <w:sz w:val="22"/>
-          <w:szCs w:val="22"/>
-        </w:rPr>
-        <w:t xml:space="preserve">Freelance | Remote</w:t>
+          <w:b/>
+          <w:bCs/>
+          <w:sz w:val="22"/>
+          <w:szCs w:val="22"/>
+        </w:rPr>
+        <w:t xml:space="preserve">Freelance</w:t>
+      </w:r>
+      <w:r>
+        <w:rPr>
+          <w:rFonts w:ascii="Calibri" w:cs="Calibri" w:eastAsia="Calibri" w:hAnsi="Calibri"/>
+          <w:sz w:val="22"/>
+          <w:szCs w:val="22"/>
+        </w:rPr>
+        <w:t xml:space="preserve"> | Remote</w:t>
       </w:r>
     </w:p>
     <w:p>
@@ -765,7 +805,7 @@
           <w:sz w:val="22"/>
           <w:szCs w:val="22"/>
         </w:rPr>
-        <w:t xml:space="preserve">Conducted keyword research, search intent analysis, on-page optimisation, technical SEO, and link-building campaigns.</w:t>
+        <w:t xml:space="preserve">Conducted keyword research, search intent analysis, on-page optimization, technical SEO, and link-building campaigns.</w:t>
       </w:r>
     </w:p>
     <w:p>
@@ -801,7 +841,7 @@
           <w:sz w:val="22"/>
           <w:szCs w:val="22"/>
         </w:rPr>
-        <w:t xml:space="preserve">Improved organic visibility and keyword rankings, including achieving Top 10 rankings for target keywords across multiple client websites.</w:t>
+        <w:t xml:space="preserve">Improved organic visibility and keyword rankings, achieving up to 40% growth in organic traffic and Top 10 rankings for target keywords across multiple client websites.</w:t>
       </w:r>
     </w:p>
     <w:p>
@@ -828,10 +868,20 @@
       <w:r>
         <w:rPr>
           <w:rFonts w:ascii="Calibri" w:cs="Calibri" w:eastAsia="Calibri" w:hAnsi="Calibri"/>
-          <w:sz w:val="22"/>
-          <w:szCs w:val="22"/>
-        </w:rPr>
-        <w:t xml:space="preserve">TechnologyAdvice | Remote</w:t>
+          <w:b/>
+          <w:bCs/>
+          <w:sz w:val="22"/>
+          <w:szCs w:val="22"/>
+        </w:rPr>
+        <w:t xml:space="preserve">TechnologyAdvice</w:t>
+      </w:r>
+      <w:r>
+        <w:rPr>
+          <w:rFonts w:ascii="Calibri" w:cs="Calibri" w:eastAsia="Calibri" w:hAnsi="Calibri"/>
+          <w:sz w:val="22"/>
+          <w:szCs w:val="22"/>
+        </w:rPr>
+        <w:t xml:space="preserve"> | Remote</w:t>
       </w:r>
     </w:p>
     <w:p>
@@ -900,7 +950,7 @@
           <w:sz w:val="22"/>
           <w:szCs w:val="22"/>
         </w:rPr>
-        <w:t xml:space="preserve">Monitored keyword rankings and traffic performance to identify optimisation opportunities.</w:t>
+        <w:t xml:space="preserve">Monitored keyword rankings and traffic performance to identify optimization opportunities.</w:t>
       </w:r>
     </w:p>
     <w:p>
@@ -936,7 +986,7 @@
           <w:sz w:val="22"/>
           <w:szCs w:val="22"/>
         </w:rPr>
-        <w:t xml:space="preserve">Collaborated with SEO and content teams to improve content performance and internal linking structures.</w:t>
+        <w:t xml:space="preserve">Collaborated with SEO and content teams to improve content performance and internal linking structures, contributing to a 25% increase in organic traffic across optimized topic clusters.</w:t>
       </w:r>
     </w:p>
     <w:p>
@@ -963,10 +1013,20 @@
       <w:r>
         <w:rPr>
           <w:rFonts w:ascii="Calibri" w:cs="Calibri" w:eastAsia="Calibri" w:hAnsi="Calibri"/>
-          <w:sz w:val="22"/>
-          <w:szCs w:val="22"/>
-        </w:rPr>
-        <w:t xml:space="preserve">Freelance | Remote</w:t>
+          <w:b/>
+          <w:bCs/>
+          <w:sz w:val="22"/>
+          <w:szCs w:val="22"/>
+        </w:rPr>
+        <w:t xml:space="preserve">Freelance</w:t>
+      </w:r>
+      <w:r>
+        <w:rPr>
+          <w:rFonts w:ascii="Calibri" w:cs="Calibri" w:eastAsia="Calibri" w:hAnsi="Calibri"/>
+          <w:sz w:val="22"/>
+          <w:szCs w:val="22"/>
+        </w:rPr>
+        <w:t xml:space="preserve"> | Remote</w:t>
       </w:r>
     </w:p>
     <w:p>
@@ -999,7 +1059,7 @@
           <w:sz w:val="22"/>
           <w:szCs w:val="22"/>
         </w:rPr>
-        <w:t xml:space="preserve">Supported keyword research, on-page optimisation, technical SEO, and content optimisation across client websites.</w:t>
+        <w:t xml:space="preserve">Supported keyword research, on-page optimization, technical SEO, and content optimization across client websites.</w:t>
       </w:r>
     </w:p>
     <w:p>
@@ -1035,7 +1095,7 @@
           <w:sz w:val="22"/>
           <w:szCs w:val="22"/>
         </w:rPr>
-        <w:t xml:space="preserve">Assisted with content optimisation and link-building initiatives to improve organic visibility and traffic.</w:t>
+        <w:t xml:space="preserve">Assisted with content optimization and link-building initiatives, supporting up to 20% growth in organic traffic across client websites.</w:t>
       </w:r>
     </w:p>
     <w:p>
@@ -1062,10 +1122,20 @@
       <w:r>
         <w:rPr>
           <w:rFonts w:ascii="Calibri" w:cs="Calibri" w:eastAsia="Calibri" w:hAnsi="Calibri"/>
-          <w:sz w:val="22"/>
-          <w:szCs w:val="22"/>
-        </w:rPr>
-        <w:t xml:space="preserve">Ranga Digital | Remote</w:t>
+          <w:b/>
+          <w:bCs/>
+          <w:sz w:val="22"/>
+          <w:szCs w:val="22"/>
+        </w:rPr>
+        <w:t xml:space="preserve">Ranga Digital</w:t>
+      </w:r>
+      <w:r>
+        <w:rPr>
+          <w:rFonts w:ascii="Calibri" w:cs="Calibri" w:eastAsia="Calibri" w:hAnsi="Calibri"/>
+          <w:sz w:val="22"/>
+          <w:szCs w:val="22"/>
+        </w:rPr>
+        <w:t xml:space="preserve"> | Remote</w:t>
       </w:r>
     </w:p>
     <w:p>
@@ -1098,7 +1168,7 @@
           <w:sz w:val="22"/>
           <w:szCs w:val="22"/>
         </w:rPr>
-        <w:t xml:space="preserve">Assisted with technical SEO audits, keyword research, content planning, and on-page optimisation.</w:t>
+        <w:t xml:space="preserve">Assisted with technical SEO audits, keyword research, content planning, and on-page optimization.</w:t>
       </w:r>
     </w:p>
     <w:p>
@@ -1143,10 +1213,20 @@
       <w:r>
         <w:rPr>
           <w:rFonts w:ascii="Calibri" w:cs="Calibri" w:eastAsia="Calibri" w:hAnsi="Calibri"/>
-          <w:sz w:val="22"/>
-          <w:szCs w:val="22"/>
-        </w:rPr>
-        <w:t xml:space="preserve">ANT Digital | Remote</w:t>
+          <w:b/>
+          <w:bCs/>
+          <w:sz w:val="22"/>
+          <w:szCs w:val="22"/>
+        </w:rPr>
+        <w:t xml:space="preserve">ANT Digital</w:t>
+      </w:r>
+      <w:r>
+        <w:rPr>
+          <w:rFonts w:ascii="Calibri" w:cs="Calibri" w:eastAsia="Calibri" w:hAnsi="Calibri"/>
+          <w:sz w:val="22"/>
+          <w:szCs w:val="22"/>
+        </w:rPr>
+        <w:t xml:space="preserve"> | Remote</w:t>
       </w:r>
     </w:p>
     <w:p>
@@ -1179,7 +1259,7 @@
           <w:sz w:val="22"/>
           <w:szCs w:val="22"/>
         </w:rPr>
-        <w:t xml:space="preserve">Assisted with technical SEO audits, keyword research, content planning, and on-page optimisation.</w:t>
+        <w:t xml:space="preserve">Assisted with technical SEO audits, keyword research, content planning, and on-page optimization.</w:t>
       </w:r>
     </w:p>
     <w:p>
@@ -1224,10 +1304,20 @@
       <w:r>
         <w:rPr>
           <w:rFonts w:ascii="Calibri" w:cs="Calibri" w:eastAsia="Calibri" w:hAnsi="Calibri"/>
-          <w:sz w:val="22"/>
-          <w:szCs w:val="22"/>
-        </w:rPr>
-        <w:t xml:space="preserve">Freelance | Remote</w:t>
+          <w:b/>
+          <w:bCs/>
+          <w:sz w:val="22"/>
+          <w:szCs w:val="22"/>
+        </w:rPr>
+        <w:t xml:space="preserve">Freelance</w:t>
+      </w:r>
+      <w:r>
+        <w:rPr>
+          <w:rFonts w:ascii="Calibri" w:cs="Calibri" w:eastAsia="Calibri" w:hAnsi="Calibri"/>
+          <w:sz w:val="22"/>
+          <w:szCs w:val="22"/>
+        </w:rPr>
+        <w:t xml:space="preserve"> | Remote</w:t>
       </w:r>
     </w:p>
     <w:p>
@@ -1260,7 +1350,7 @@
           <w:sz w:val="22"/>
           <w:szCs w:val="22"/>
         </w:rPr>
-        <w:t xml:space="preserve">Built and maintained responsive websites with a focus on usability, mobile optimisation, and cross-browser compatibility.</w:t>
+        <w:t xml:space="preserve">Built and maintained responsive websites with a focus on usability, mobile optimization, and cross-browser compatibility.</w:t>
       </w:r>
     </w:p>
     <w:p>
@@ -1296,7 +1386,7 @@
           <w:sz w:val="22"/>
           <w:szCs w:val="22"/>
         </w:rPr>
-        <w:t xml:space="preserve">Implemented front-end improvements to enhance website performance, usability, and user experience.</w:t>
+        <w:t xml:space="preserve">Implemented front-end improvements that reduced page load times by 25% and enhanced website usability and user experience.</w:t>
       </w:r>
     </w:p>
     <w:p>
@@ -1331,15 +1421,15 @@
           <w:sz w:val="22"/>
           <w:szCs w:val="22"/>
         </w:rPr>
-        <w:t xml:space="preserve">SEO Tools: </w:t>
-      </w:r>
-      <w:r>
-        <w:rPr>
-          <w:rFonts w:ascii="Calibri" w:cs="Calibri" w:eastAsia="Calibri" w:hAnsi="Calibri"/>
-          <w:sz w:val="22"/>
-          <w:szCs w:val="22"/>
-        </w:rPr>
-        <w:t xml:space="preserve">Google Search Console, Google Analytics 4, Ahrefs, Screaming Frog, Semrush, PageSpeed Insights, Google Tag Manager, Microsoft Clarity, Rank Math, Yoast SEO, Looker Studio</w:t>
+        <w:t xml:space="preserve">SEO Tools:</w:t>
+      </w:r>
+      <w:r>
+        <w:rPr>
+          <w:rFonts w:ascii="Calibri" w:cs="Calibri" w:eastAsia="Calibri" w:hAnsi="Calibri"/>
+          <w:sz w:val="22"/>
+          <w:szCs w:val="22"/>
+        </w:rPr>
+        <w:t xml:space="preserve"> Google Search Console, Google Analytics 4, Ahrefs, Screaming Frog, Semrush, PageSpeed Insights, Google Tag Manager, Microsoft Clarity, Rank Math, Yoast SEO, Looker Studio</w:t>
       </w:r>
     </w:p>
     <w:p>
@@ -1354,15 +1444,15 @@
           <w:sz w:val="22"/>
           <w:szCs w:val="22"/>
         </w:rPr>
-        <w:t xml:space="preserve">AI Tools and Generative Search: </w:t>
-      </w:r>
-      <w:r>
-        <w:rPr>
-          <w:rFonts w:ascii="Calibri" w:cs="Calibri" w:eastAsia="Calibri" w:hAnsi="Calibri"/>
-          <w:sz w:val="22"/>
-          <w:szCs w:val="22"/>
-        </w:rPr>
-        <w:t xml:space="preserve">Claude (Claude Code, Claude Projects, custom Skills, and MCP integrations with Ahrefs, Google Search Console, and Google Drive), ChatGPT, Google Gemini, Perplexity, Ahrefs Brand Radar for AI search visibility, AI-assisted keyword clustering, content briefing, and bulk SEO audits</w:t>
+        <w:t xml:space="preserve">AI Tools and Generative Search:</w:t>
+      </w:r>
+      <w:r>
+        <w:rPr>
+          <w:rFonts w:ascii="Calibri" w:cs="Calibri" w:eastAsia="Calibri" w:hAnsi="Calibri"/>
+          <w:sz w:val="22"/>
+          <w:szCs w:val="22"/>
+        </w:rPr>
+        <w:t xml:space="preserve"> Claude (Claude Code, Claude Projects, custom Skills, and MCP integrations with Ahrefs, Google Search Console, and Google Drive), ChatGPT, Google Gemini, Perplexity, Ahrefs Brand Radar for AI search visibility, AI-assisted keyword clustering, content briefing, and bulk SEO audits</w:t>
       </w:r>
     </w:p>
     <w:p>
@@ -1377,15 +1467,15 @@
           <w:sz w:val="22"/>
           <w:szCs w:val="22"/>
         </w:rPr>
-        <w:t xml:space="preserve">Web Development: </w:t>
-      </w:r>
-      <w:r>
-        <w:rPr>
-          <w:rFonts w:ascii="Calibri" w:cs="Calibri" w:eastAsia="Calibri" w:hAnsi="Calibri"/>
-          <w:sz w:val="22"/>
-          <w:szCs w:val="22"/>
-        </w:rPr>
-        <w:t xml:space="preserve">WordPress, Shopify, Webflow, WooCommerce, Elementor, Divi, HTML, CSS</w:t>
+        <w:t xml:space="preserve">Web Development:</w:t>
+      </w:r>
+      <w:r>
+        <w:rPr>
+          <w:rFonts w:ascii="Calibri" w:cs="Calibri" w:eastAsia="Calibri" w:hAnsi="Calibri"/>
+          <w:sz w:val="22"/>
+          <w:szCs w:val="22"/>
+        </w:rPr>
+        <w:t xml:space="preserve"> WordPress, Shopify, Webflow, WooCommerce, Elementor, Divi, HTML, CSS</w:t>
       </w:r>
     </w:p>
     <w:p>
@@ -1438,7 +1528,7 @@
     </w:p>
     <w:p>
       <w:pPr>
-        <w:spacing w:after="60" w:line="252"/>
+        <w:spacing w:after="80" w:line="252"/>
       </w:pPr>
       <w:r>
         <w:rPr>

</xml_diff>